<commit_message>
feat: add fix job publishing workflow
</commit_message>
<xml_diff>
--- a/INTERNSHIP_REPORT_REPOGUARD_AI_JVB_EXPANDED.docx
+++ b/INTERNSHIP_REPORT_REPOGUARD_AI_JVB_EXPANDED.docx
@@ -181,7 +181,7 @@
                   <v:path o:extrusionok="f" gradientshapeok="t" o:connecttype="rect"/>
                   <o:lock v:ext="edit" aspectratio="t"/>
                 </v:shapetype>
-                <v:shape id="Picture 2" o:spid="_x0000_i1025" type="#_x0000_t75" style="width:109.7pt;height:108pt;visibility:visible">
+                <v:shape id="Picture 2" o:spid="_x0000_i1025" type="#_x0000_t75" style="width:109.8pt;height:108pt;visibility:visible">
                   <v:imagedata r:id="rId8" o:title=""/>
                 </v:shape>
               </w:pict>
@@ -433,7 +433,21 @@
                 <w:sz w:val="36"/>
                 <w:lang w:val="vi-VN" w:eastAsia="ja-JP" w:bidi="hi-IN"/>
               </w:rPr>
-              <w:t xml:space="preserve">                           Supervisor:                       </w:t>
+              <w:t xml:space="preserve">                           Supervisor:</w:t>
+            </w:r>
+            <w:r>
+              <w:rPr>
+                <w:sz w:val="36"/>
+                <w:lang w:val="vi-VN" w:eastAsia="ja-JP" w:bidi="hi-IN"/>
+              </w:rPr>
+              <w:t xml:space="preserve"> Nguyễn Văn Dũng</w:t>
+            </w:r>
+            <w:r>
+              <w:rPr>
+                <w:sz w:val="36"/>
+                <w:lang w:val="vi-VN" w:eastAsia="ja-JP" w:bidi="hi-IN"/>
+              </w:rPr>
+              <w:t xml:space="preserve">          </w:t>
             </w:r>
           </w:p>
           <w:p>
@@ -2427,75 +2441,72 @@
     </w:p>
     <w:p>
       <w:pPr>
-        <w:rPr>
-          <w:sz w:val="28"/>
-          <w:szCs w:val="28"/>
-          <w:lang w:val="vi-VN"/>
-        </w:rPr>
-      </w:pPr>
-      <w:r>
-        <w:rPr>
-          <w:sz w:val="28"/>
-          <w:szCs w:val="28"/>
-        </w:rPr>
-        <w:t xml:space="preserve">I would like to express my deep appreciation to JVB Viet Nam Joint Stock Company for providing me with the opportunity to undertake this internship, and to my supervisor, </w:t>
-      </w:r>
-      <w:r>
-        <w:rPr>
-          <w:b/>
-          <w:bCs/>
-          <w:sz w:val="28"/>
-          <w:szCs w:val="28"/>
-          <w:lang w:val="vi-VN"/>
-        </w:rPr>
-        <w:t xml:space="preserve">                                 </w:t>
-      </w:r>
-      <w:r>
-        <w:rPr>
-          <w:sz w:val="28"/>
-          <w:szCs w:val="28"/>
-        </w:rPr>
-        <w:t xml:space="preserve">, for the valuable guidance and support throughout my internship. </w:t>
-      </w:r>
-    </w:p>
-    <w:p>
-      <w:r>
-        <w:rPr>
-          <w:sz w:val="28"/>
-          <w:szCs w:val="28"/>
-        </w:rPr>
-        <w:t>I would also like to express my sincere thanks to my lecturer, Dr</w:t>
-      </w:r>
-      <w:r>
-        <w:rPr>
-          <w:sz w:val="28"/>
-          <w:szCs w:val="28"/>
-          <w:lang w:val="vi-VN"/>
-        </w:rPr>
-        <w:t>. Dương Lê Minh</w:t>
-      </w:r>
-      <w:r>
-        <w:rPr>
-          <w:sz w:val="28"/>
-          <w:szCs w:val="28"/>
-        </w:rPr>
-        <w:t>, for the helpful advice and encouragement during the completion of this</w:t>
-      </w:r>
-      <w:r>
-        <w:rPr>
-          <w:sz w:val="28"/>
-          <w:szCs w:val="28"/>
-          <w:lang w:val="vi-VN"/>
-        </w:rPr>
-        <w:t xml:space="preserve"> </w:t>
-      </w:r>
-      <w:r>
-        <w:rPr>
-          <w:sz w:val="28"/>
-          <w:szCs w:val="28"/>
-        </w:rPr>
-        <w:t xml:space="preserve">internship. </w:t>
-      </w:r>
+        <w:jc w:val="left"/>
+        <w:rPr>
+          <w:sz w:val="28"/>
+          <w:szCs w:val="28"/>
+        </w:rPr>
+      </w:pPr>
+      <w:r>
+        <w:rPr>
+          <w:sz w:val="28"/>
+          <w:szCs w:val="28"/>
+        </w:rPr>
+        <w:t>I would like to express my deepest appreciation to JVB Viet Nam Joint Stock Company for providing me with the valuable opportunity to undertake this internship. This experience allowed me to gain practical knowledge, improve my professional skills, and develop a better understanding of the working environment in the information technology industry.</w:t>
+      </w:r>
+    </w:p>
+    <w:p>
+      <w:pPr>
+        <w:jc w:val="left"/>
+        <w:rPr>
+          <w:sz w:val="28"/>
+          <w:szCs w:val="28"/>
+        </w:rPr>
+      </w:pPr>
+      <w:r>
+        <w:rPr>
+          <w:sz w:val="28"/>
+          <w:szCs w:val="28"/>
+        </w:rPr>
+        <w:t>I am especially grateful to my supervisor, Mr. Nguyễn Văn Dũng, for his valuable guidance, dedicated support, and constructive feedback throughout my internship. His knowledge, patience, and encouragement greatly assisted me in completing my assigned tasks and overcoming the challenges I encountered during the internship period.</w:t>
+      </w:r>
+    </w:p>
+    <w:p>
+      <w:pPr>
+        <w:jc w:val="left"/>
+        <w:rPr>
+          <w:sz w:val="28"/>
+          <w:szCs w:val="28"/>
+        </w:rPr>
+      </w:pPr>
+      <w:r>
+        <w:rPr>
+          <w:sz w:val="28"/>
+          <w:szCs w:val="28"/>
+        </w:rPr>
+        <w:t>I would also like to express my sincere gratitude to my lecturer, Dr. Dương Lê Minh, for his helpful advice, thoughtful guidance, and continuous encouragement during the preparation and completion of this internship report. His support played an important role in helping me successfully complete both the internship and this report.</w:t>
+      </w:r>
+    </w:p>
+    <w:p>
+      <w:pPr>
+        <w:jc w:val="left"/>
+        <w:rPr>
+          <w:sz w:val="28"/>
+          <w:szCs w:val="28"/>
+        </w:rPr>
+      </w:pPr>
+      <w:r>
+        <w:rPr>
+          <w:sz w:val="28"/>
+          <w:szCs w:val="28"/>
+        </w:rPr>
+        <w:t>Finally, I would like to thank everyone who supported and assisted me during my internship. Their contributions made this experience both meaningful and beneficial to my personal and professional development.</w:t>
+      </w:r>
+    </w:p>
+    <w:p>
+      <w:pPr>
+        <w:jc w:val="left"/>
+      </w:pPr>
       <w:r>
         <w:br w:type="page"/>
       </w:r>
@@ -3226,7 +3237,14 @@
           <w:sz w:val="28"/>
           <w:szCs w:val="28"/>
         </w:rPr>
-        <w:t>The project applies a layered web architecture in which API routes validate requests, services contain business logic, repositories handle persistence, and databases store application state. Long-running repository reviews are processed by background workers instead of normal HTTP requests. Redis and Server-Sent Events are used to publish progress to the browser.</w:t>
+        <w:t xml:space="preserve">The project applies a layered web architecture in which API routes validate requests, services contain business logic, repositories handle persistence, and </w:t>
+      </w:r>
+      <w:r>
+        <w:rPr>
+          <w:sz w:val="28"/>
+          <w:szCs w:val="28"/>
+        </w:rPr>
+        <w:t>databases store application state. Long-running repository reviews are processed by background workers instead of normal HTTP requests. Redis and Server-Sent Events are used to publish progress to the browser.</w:t>
       </w:r>
     </w:p>
     <w:p>
@@ -3245,25 +3263,72 @@
       </w:r>
     </w:p>
     <w:p>
+      <w:pPr>
+        <w:rPr>
+          <w:sz w:val="28"/>
+          <w:szCs w:val="28"/>
+        </w:rPr>
+      </w:pPr>
       <w:bookmarkStart w:id="23" w:name="_Toc236296482"/>
       <w:bookmarkStart w:id="24" w:name="_Toc236300055"/>
       <w:r>
+        <w:rPr>
+          <w:sz w:val="28"/>
+          <w:szCs w:val="28"/>
+        </w:rPr>
         <w:t>The architectural foundation is separation of concerns. FastAPI maps HTTP requests and supports dependency injection, Pydantic validates typed data at system boundaries, SQLAlchemy provides object-relational persistence, and Alembic manages controlled schema evolution [1]-[4]. In a review platform, this separation keeps authentication, repository ownership, job transitions, and report retrieval from becoming mixed with transport or database code. It also makes individual layers easier to test and replace. The relational database remains the system of record for durable entities, while specialized stores are introduced only for workloads that require document, cache, messaging, or vector capabilities.</w:t>
       </w:r>
     </w:p>
     <w:p>
-      <w:r>
-        <w:t>Repository analysis is a long-running and failure-prone workflow, so it should not execute inside a normal HTTP request. A task queue lets the API create a pending job and return immediately, while a worker performs cloning, analysis, indexing, and report generation [10]. Reliable background processing requires explicit states, repeat-safe operations, cancellation checkpoints, time limits, and cleanup that runs for both success and failure. Redis can coordinate the Celery broker and short-lived progress state, but durable ownership and final results must remain in persistent storage because Pub/Sub delivery is transient [7], [10].</w:t>
-      </w:r>
-    </w:p>
-    <w:p>
-      <w:r>
+      <w:pPr>
+        <w:rPr>
+          <w:sz w:val="28"/>
+          <w:szCs w:val="28"/>
+        </w:rPr>
+      </w:pPr>
+      <w:r>
+        <w:rPr>
+          <w:sz w:val="28"/>
+          <w:szCs w:val="28"/>
+        </w:rPr>
+        <w:t xml:space="preserve">Repository analysis is a long-running and failure-prone workflow, so it should not execute inside a normal HTTP request. A task queue lets the API create a pending job and return immediately, while a worker performs cloning, analysis, indexing, and report generation [10]. Reliable background processing </w:t>
+      </w:r>
+      <w:r>
+        <w:rPr>
+          <w:sz w:val="28"/>
+          <w:szCs w:val="28"/>
+        </w:rPr>
         <w:lastRenderedPageBreak/>
+        <w:t>requires explicit states, repeat-safe operations, cancellation checkpoints, time limits, and cleanup that runs for both success and failure. Redis can coordinate the Celery broker and short-lived progress state, but durable ownership and final results must remain in persistent storage because Pub/Sub delivery is transient [7], [10].</w:t>
+      </w:r>
+    </w:p>
+    <w:p>
+      <w:pPr>
+        <w:rPr>
+          <w:sz w:val="28"/>
+          <w:szCs w:val="28"/>
+        </w:rPr>
+      </w:pPr>
+      <w:r>
+        <w:rPr>
+          <w:sz w:val="28"/>
+          <w:szCs w:val="28"/>
+        </w:rPr>
         <w:t>Static analysis examines source code without executing the target application. Ruff applies configurable lint rules to Python source, Bandit searches Python abstract syntax trees for common security risks, and ESLint provides rule-based analysis for JavaScript and TypeScript [15]-[17]. These tools are fast, deterministic, and suitable for automation, but they emit different fields, severities, and rule identifiers. A multi-language product therefore needs a normalization layer that preserves the original tool and rule while mapping every finding to a common issue model containing category, severity, file path, line range, message, and remediation.</w:t>
       </w:r>
     </w:p>
     <w:p>
-      <w:r>
+      <w:pPr>
+        <w:rPr>
+          <w:sz w:val="28"/>
+          <w:szCs w:val="28"/>
+        </w:rPr>
+      </w:pPr>
+      <w:r>
+        <w:rPr>
+          <w:sz w:val="28"/>
+          <w:szCs w:val="28"/>
+        </w:rPr>
         <w:t>Retrieval-Augmented Generation addresses the context limitation of language models by retrieving a small evidence set before generation [18]. For source code, lexical retrieval such as BM25 is useful when queries contain exact identifiers, configuration keys, or library names, whereas embedding similarity can recover conceptually related code that uses different wording [19]. ChromaDB supports vector search and metadata filtering, which can restrict candidates by repository, branch, language, path, or chunk type [20]. Hybrid retrieval improves coverage, but retrieval alone does not guarantee correctness; every accepted issue still needs a real source path, valid line evidence, and a structured explanation.</w:t>
       </w:r>
     </w:p>
@@ -3356,139 +3421,194 @@
           <w:sz w:val="28"/>
           <w:szCs w:val="28"/>
         </w:rPr>
-        <w:t>The review pipeline clones a repository, filters files, detects its structure, and runs Ruff, Bandit, ESLint, and secret scanning. Source files are then divided into chunks and indexed. The AI stage retrieves relevant chunks using lexical and semantic signals, evaluates focused review probes, and accepts a finding only when it contains valid source evidence. Finally, the system generates a structured report and streams progress to the user through SSE.</w:t>
-      </w:r>
-    </w:p>
-    <w:p>
+        <w:t xml:space="preserve">The review pipeline clones a repository, filters files, detects its structure, and runs Ruff, Bandit, ESLint, and secret scanning. Source files are then divided into chunks and indexed. The AI stage retrieves relevant chunks using lexical and semantic signals, evaluates focused review probes, and accepts a finding only when it contains valid source evidence. Finally, the system generates a </w:t>
+      </w:r>
+      <w:r>
+        <w:rPr>
+          <w:sz w:val="28"/>
+          <w:szCs w:val="28"/>
+        </w:rPr>
+        <w:t>structured report and streams progress to the user through SSE.</w:t>
+      </w:r>
+    </w:p>
+    <w:p>
+      <w:pPr>
+        <w:rPr>
+          <w:sz w:val="28"/>
+          <w:szCs w:val="28"/>
+        </w:rPr>
+      </w:pPr>
       <w:bookmarkStart w:id="25" w:name="_Toc236296483"/>
       <w:bookmarkStart w:id="26" w:name="_Toc236300056"/>
       <w:r>
-        <w:t>In the implemented solution, every repository, review job, issue, report, progress stream, and AI trace is owner-scoped. FastAPI dependencies authenticate the request and load only resources belonging to the current user. JWT access and refresh flows, token revocation, secure cookies, validation, and rate limiting provide the outer security controls, while service-layer authorization prevents an identifier from becoming an access bypass. These decisions follow the principle that access control must be enforced on every protected resource, not only in the user interface [11].</w:t>
-      </w:r>
-    </w:p>
-    <w:p>
-      <w:r>
+        <w:rPr>
+          <w:sz w:val="28"/>
+          <w:szCs w:val="28"/>
+        </w:rPr>
+        <w:t xml:space="preserve">In the implemented solution, every repository, review job, issue, report, progress stream, and AI trace is owner-scoped. FastAPI dependencies </w:t>
+      </w:r>
+      <w:r>
+        <w:rPr>
+          <w:sz w:val="28"/>
+          <w:szCs w:val="28"/>
+        </w:rPr>
+        <w:lastRenderedPageBreak/>
+        <w:t>authenticate the request and load only resources belonging to the current user. JWT access and refresh flows, token revocation, secure cookies, validation, and rate limiting provide the outer security controls, while service-layer authorization prevents an identifier from becoming an access bypass. These decisions follow the principle that access control must be enforced on every protected resource, not only in the user interface [11].</w:t>
+      </w:r>
+    </w:p>
+    <w:p>
+      <w:pPr>
+        <w:rPr>
+          <w:sz w:val="28"/>
+          <w:szCs w:val="28"/>
+        </w:rPr>
+      </w:pPr>
+      <w:r>
+        <w:rPr>
+          <w:sz w:val="28"/>
+          <w:szCs w:val="28"/>
+        </w:rPr>
         <w:t>When a review is created, the API persists the job before dispatching its identifier to Celery. The worker creates an isolated temporary workspace, performs a shallow clone of the selected branch, checks repository limits, records the commit, and filters generated, binary, dependency, and oversized files. Structure analysis then identifies languages, frameworks, manifests, and the source tree. Ruff, Bandit, ESLint, and secret scanning run only against supported inputs. Their raw outputs are retained for traceability and converted to the normalized issue contract used by the report and frontend.</w:t>
       </w:r>
     </w:p>
     <w:p>
-      <w:r>
+      <w:pPr>
+        <w:rPr>
+          <w:sz w:val="28"/>
+          <w:szCs w:val="28"/>
+        </w:rPr>
+      </w:pPr>
+      <w:r>
+        <w:rPr>
+          <w:sz w:val="28"/>
+          <w:szCs w:val="28"/>
+        </w:rPr>
+        <w:t>The AI stage is backend-directed rather than an unrestricted conversation with the repository. The backend creates focused probes for authentication, authorization, injection, transactions, resource lifecycles, pagination, secrets, and maintainability. Each probe retrieves candidate code with lexical, semantic, exact, and structural signals. The model receives a bounded evidence bundle and must return a typed candidate. Before persistence, the backend verifies repository scope, source path, and line range, removes duplicates, and rejects unsupported claims. Final severity totals and scores are calculated from persisted data instead of free-form model arithmetic.</w:t>
+      </w:r>
+    </w:p>
+    <w:p>
+      <w:pPr>
+        <w:rPr>
+          <w:sz w:val="28"/>
+          <w:szCs w:val="28"/>
+        </w:rPr>
+      </w:pPr>
+      <w:r>
+        <w:rPr>
+          <w:sz w:val="28"/>
+          <w:szCs w:val="28"/>
+        </w:rPr>
+        <w:t>Storage responsibilities follow the access pattern of each data type. PostgreSQL stores users, repositories, jobs, normalized issues, and final reports; MongoDB stores flexible analysis artifacts, summaries, and AI traces; Redis stores queue coordination, rate-limit state, progress snapshots, and Pub/Sub events; and ChromaDB stores scoped vectors. The browser receives one-way progress through native EventSource and SSE, an approach defined for server-to-client event streams [21]. A reconnect first receives the latest Redis snapshot, then resumes live events, so a temporary network interruption does not stop the worker or erase the visible job state.</w:t>
+      </w:r>
+    </w:p>
+    <w:p>
+      <w:pPr>
+        <w:pStyle w:val="Heading21"/>
+        <w:rPr>
+          <w:sz w:val="28"/>
+          <w:szCs w:val="28"/>
+        </w:rPr>
+      </w:pPr>
+      <w:r>
+        <w:rPr>
+          <w:sz w:val="28"/>
+          <w:szCs w:val="28"/>
+        </w:rPr>
+        <w:t>3</w:t>
+      </w:r>
+      <w:r>
+        <w:rPr>
+          <w:sz w:val="28"/>
+          <w:szCs w:val="28"/>
+          <w:lang w:val="vi-VN"/>
+        </w:rPr>
+        <w:t>.3</w:t>
+      </w:r>
+      <w:r>
+        <w:rPr>
+          <w:sz w:val="28"/>
+          <w:szCs w:val="28"/>
+        </w:rPr>
+        <w:t xml:space="preserve">. </w:t>
+      </w:r>
+      <w:bookmarkEnd w:id="25"/>
+      <w:r>
+        <w:rPr>
+          <w:sz w:val="28"/>
+          <w:szCs w:val="28"/>
+        </w:rPr>
+        <w:t>Comparison</w:t>
+      </w:r>
+      <w:r>
+        <w:rPr>
+          <w:sz w:val="28"/>
+          <w:szCs w:val="28"/>
+        </w:rPr>
+        <w:t xml:space="preserve"> with alternative approaches</w:t>
+      </w:r>
+      <w:bookmarkEnd w:id="26"/>
+    </w:p>
+    <w:p>
+      <w:pPr>
+        <w:rPr>
+          <w:sz w:val="28"/>
+          <w:szCs w:val="28"/>
+        </w:rPr>
+      </w:pPr>
+      <w:r>
+        <w:rPr>
+          <w:sz w:val="28"/>
+          <w:szCs w:val="28"/>
+        </w:rPr>
+        <w:t>The related theories provide general methods, while my solution adapts them to a complete working product:</w:t>
+      </w:r>
+    </w:p>
+    <w:p>
+      <w:pPr>
+        <w:pStyle w:val="ReportList"/>
+        <w:rPr>
+          <w:sz w:val="28"/>
+          <w:szCs w:val="28"/>
+        </w:rPr>
+      </w:pPr>
+      <w:r>
+        <w:rPr>
+          <w:sz w:val="28"/>
+          <w:szCs w:val="28"/>
+        </w:rPr>
+        <w:t>• Static-analysis theory is implemented through multiple analyzers whose outputs are converted into one common issue format.</w:t>
+      </w:r>
+    </w:p>
+    <w:p>
+      <w:pPr>
+        <w:pStyle w:val="ReportList"/>
+        <w:rPr>
+          <w:sz w:val="28"/>
+          <w:szCs w:val="28"/>
+        </w:rPr>
+      </w:pPr>
+      <w:r>
+        <w:rPr>
+          <w:sz w:val="28"/>
+          <w:szCs w:val="28"/>
+        </w:rPr>
+        <w:t>• RAG theory is implemented through source-code chunking, BM25 and vector retrieval, scoped embeddings, and evidence validation.</w:t>
+      </w:r>
+    </w:p>
+    <w:p>
+      <w:pPr>
+        <w:pStyle w:val="ReportList"/>
+        <w:rPr>
+          <w:sz w:val="28"/>
+          <w:szCs w:val="28"/>
+        </w:rPr>
+      </w:pPr>
+      <w:r>
+        <w:rPr>
+          <w:sz w:val="28"/>
+          <w:szCs w:val="28"/>
+        </w:rPr>
         <w:lastRenderedPageBreak/>
-        <w:t>The AI stage is backend-directed rather than an unrestricted conversation with the repository. The backend creates focused probes for authentication, authorization, injection, transactions, resource lifecycles, pagination, secrets, and maintainability. Each probe retrieves candidate code with lexical, semantic, exact, and structural signals. The model receives a bounded evidence bundle and must return a typed candidate. Before persistence, the backend verifies repository scope, source path, and line range, removes duplicates, and rejects unsupported claims. Final severity totals and scores are calculated from persisted data instead of free-form model arithmetic.</w:t>
-      </w:r>
-    </w:p>
-    <w:p>
-      <w:r>
-        <w:t>Storage responsibilities follow the access pattern of each data type. PostgreSQL stores users, repositories, jobs, normalized issues, and final reports; MongoDB stores flexible analysis artifacts, summaries, and AI traces; Redis stores queue coordination, rate-limit state, progress snapshots, and Pub/Sub events; and ChromaDB stores scoped vectors. The browser receives one-way progress through native EventSource and SSE, an approach defined for server-to-client event streams [21]. A reconnect first receives the latest Redis snapshot, then resumes live events, so a temporary network interruption does not stop the worker or erase the visible job state.</w:t>
-      </w:r>
-    </w:p>
-    <w:p>
-      <w:pPr>
-        <w:pStyle w:val="Heading21"/>
-        <w:rPr>
-          <w:sz w:val="28"/>
-          <w:szCs w:val="28"/>
-        </w:rPr>
-      </w:pPr>
-      <w:r>
-        <w:rPr>
-          <w:sz w:val="28"/>
-          <w:szCs w:val="28"/>
-        </w:rPr>
-        <w:t>3</w:t>
-      </w:r>
-      <w:r>
-        <w:rPr>
-          <w:sz w:val="28"/>
-          <w:szCs w:val="28"/>
-          <w:lang w:val="vi-VN"/>
-        </w:rPr>
-        <w:t>.3</w:t>
-      </w:r>
-      <w:r>
-        <w:rPr>
-          <w:sz w:val="28"/>
-          <w:szCs w:val="28"/>
-        </w:rPr>
-        <w:t xml:space="preserve">. </w:t>
-      </w:r>
-      <w:bookmarkEnd w:id="25"/>
-      <w:r>
-        <w:rPr>
-          <w:sz w:val="28"/>
-          <w:szCs w:val="28"/>
-        </w:rPr>
-        <w:t>Comparison</w:t>
-      </w:r>
-      <w:r>
-        <w:rPr>
-          <w:sz w:val="28"/>
-          <w:szCs w:val="28"/>
-        </w:rPr>
-        <w:t xml:space="preserve"> with alternative approaches</w:t>
-      </w:r>
-      <w:bookmarkEnd w:id="26"/>
-    </w:p>
-    <w:p>
-      <w:pPr>
-        <w:rPr>
-          <w:sz w:val="28"/>
-          <w:szCs w:val="28"/>
-        </w:rPr>
-      </w:pPr>
-      <w:r>
-        <w:rPr>
-          <w:sz w:val="28"/>
-          <w:szCs w:val="28"/>
-        </w:rPr>
-        <w:t>The related theories provide general methods, while my solution adapts them to a complete working product:</w:t>
-      </w:r>
-    </w:p>
-    <w:p>
-      <w:pPr>
-        <w:pStyle w:val="ReportList"/>
-        <w:rPr>
-          <w:sz w:val="28"/>
-          <w:szCs w:val="28"/>
-        </w:rPr>
-      </w:pPr>
-      <w:r>
-        <w:rPr>
-          <w:sz w:val="28"/>
-          <w:szCs w:val="28"/>
-        </w:rPr>
-        <w:t>• Static-analysis theory is implemented through multiple analyzers whose outputs are converted into one common issue format.</w:t>
-      </w:r>
-    </w:p>
-    <w:p>
-      <w:pPr>
-        <w:pStyle w:val="ReportList"/>
-        <w:rPr>
-          <w:sz w:val="28"/>
-          <w:szCs w:val="28"/>
-        </w:rPr>
-      </w:pPr>
-      <w:r>
-        <w:rPr>
-          <w:sz w:val="28"/>
-          <w:szCs w:val="28"/>
-        </w:rPr>
-        <w:t>• RAG theory is implemented through source-code chunking, BM25 and vector retrieval, scoped embeddings, and evidence validation.</w:t>
-      </w:r>
-    </w:p>
-    <w:p>
-      <w:pPr>
-        <w:pStyle w:val="ReportList"/>
-        <w:rPr>
-          <w:sz w:val="28"/>
-          <w:szCs w:val="28"/>
-        </w:rPr>
-      </w:pPr>
-      <w:r>
-        <w:rPr>
-          <w:sz w:val="28"/>
-          <w:szCs w:val="28"/>
-        </w:rPr>
         <w:t>• Background-processing theory is implemented with Celery jobs, explicit review states, failure handling, and cancellation.</w:t>
       </w:r>
     </w:p>
@@ -3614,25 +3734,62 @@
           <w:sz w:val="28"/>
           <w:szCs w:val="28"/>
         </w:rPr>
-        <w:lastRenderedPageBreak/>
         <w:t>PostgreSQL stores users, repositories, jobs, issues, and reports. MongoDB stores analysis artifacts and AI traces, Redis supports the job queue and realtime progress, and ChromaDB stores vectors for retrieval. The installation of individual dependencies and plugins is omitted because Docker builds them automatically from the project configuration.</w:t>
       </w:r>
     </w:p>
     <w:p>
+      <w:pPr>
+        <w:rPr>
+          <w:sz w:val="28"/>
+          <w:szCs w:val="28"/>
+        </w:rPr>
+      </w:pPr>
       <w:bookmarkStart w:id="32" w:name="_Toc236297251"/>
       <w:bookmarkStart w:id="33" w:name="_Toc236300059"/>
       <w:r>
+        <w:rPr>
+          <w:sz w:val="28"/>
+          <w:szCs w:val="28"/>
+        </w:rPr>
         <w:t>The main user workflow begins with registration and login, followed by repository creation with a URL and branch. Starting a review opens a dedicated workspace that displays the current state, percentage, elapsed time, connection status, and pipeline messages. After completion, the user can browse overview charts, severity and category summaries, grouped issues, remediation guidance, source context, repository structure, and the AI execution trace. These views use the same normalized report contract, so static and AI findings can be compared without hiding their original analyzer or evidence.</w:t>
       </w:r>
     </w:p>
     <w:p>
-      <w:r>
+      <w:pPr>
+        <w:rPr>
+          <w:sz w:val="28"/>
+          <w:szCs w:val="28"/>
+        </w:rPr>
+      </w:pPr>
+      <w:r>
+        <w:rPr>
+          <w:sz w:val="28"/>
+          <w:szCs w:val="28"/>
+        </w:rPr>
         <w:t>The backend follows an API-service-repository structure. Routes validate external input and map errors to HTTP responses; services implement ownership checks, state transitions, orchestration, and report rules; repositories contain persistence operations. Celery tasks call the review pipeline outside the request lifecycle. Each stage publishes a normalized progress event and records enough state for failure diagnosis. Database migrations are versioned through Alembic, while the Docker Compose configuration starts the application services with health checks, persistent volumes, and explicit service networking [4], [9], [14].</w:t>
       </w:r>
     </w:p>
     <w:p>
-      <w:r>
-        <w:t>Operational safeguards are part of the product rather than optional additions. Repository URLs and branches are validated before cloning, subprocess arguments are constructed without a shell, temporary workspaces are deleted after terminal states, and cancellation is checked between expensive stages. Secret scanning occurs before code is sent to an external model. Owner-only queries protect stored results, and AI traces expose which probe, retrieved evidence, and model decision produced a candidate issue. This traceability helps distinguish deterministic analyzer output from probabilistic model output and supports later evaluation of false positives.</w:t>
+      <w:pPr>
+        <w:rPr>
+          <w:sz w:val="28"/>
+          <w:szCs w:val="28"/>
+        </w:rPr>
+      </w:pPr>
+      <w:r>
+        <w:rPr>
+          <w:sz w:val="28"/>
+          <w:szCs w:val="28"/>
+        </w:rPr>
+        <w:t xml:space="preserve">Operational safeguards are part of the product rather than optional additions. Repository URLs and branches are validated before cloning, </w:t>
+      </w:r>
+      <w:r>
+        <w:rPr>
+          <w:sz w:val="28"/>
+          <w:szCs w:val="28"/>
+        </w:rPr>
+        <w:lastRenderedPageBreak/>
+        <w:t>subprocess arguments are constructed without a shell, temporary workspaces are deleted after terminal states, and cancellation is checked between expensive stages. Secret scanning occurs before code is sent to an external model. Owner-only queries protect stored results, and AI traces expose which probe, retrieved evidence, and model decision produced a candidate issue. This traceability helps distinguish deterministic analyzer output from probabilistic model output and supports later evaluation of false positives.</w:t>
       </w:r>
     </w:p>
     <w:p>
@@ -3815,7 +3972,6 @@
         <w:rPr>
           <w:szCs w:val="28"/>
         </w:rPr>
-        <w:lastRenderedPageBreak/>
         <w:t>5</w:t>
       </w:r>
       <w:r>
@@ -4034,6 +4190,7 @@
           <w:sz w:val="28"/>
           <w:szCs w:val="28"/>
         </w:rPr>
+        <w:lastRenderedPageBreak/>
         <w:t>Designing RAG ingestion, chunk metadata, BM25 and vector retrieval, semantic code search, embedding caches, evidence ranking, and token-aware batching.</w:t>
       </w:r>
     </w:p>
@@ -4153,14 +4310,20 @@
       </w:r>
     </w:p>
     <w:p>
+      <w:pPr>
+        <w:rPr>
+          <w:sz w:val="28"/>
+          <w:szCs w:val="28"/>
+        </w:rPr>
+      </w:pPr>
       <w:bookmarkStart w:id="38" w:name="_Toc236294603"/>
       <w:bookmarkStart w:id="39" w:name="_Toc236300062"/>
       <w:r>
-        <w:t xml:space="preserve">The most significant learning outcome was the ability to treat the product as one engineering system instead of a collection of independent technologies. I learned to connect typed API contracts, authorization, persistence, queues, analyzers, retrieval, model validation, realtime delivery, and interface states through explicit boundaries. I also improved my ability to diagnose failures across containers and asynchronous processes, write behavior-focused tests, and document a reproducible development workflow. Because I completed the final project independently, I had to make and verify the architectural trade-offs, prioritize features, </w:t>
-      </w:r>
-      <w:r>
-        <w:lastRenderedPageBreak/>
-        <w:t>control scope, and maintain consistency between backend, frontend, infrastructure, tests, and documentation [14].</w:t>
+        <w:rPr>
+          <w:sz w:val="28"/>
+          <w:szCs w:val="28"/>
+        </w:rPr>
+        <w:t>The most significant learning outcome was the ability to treat the product as one engineering system instead of a collection of independent technologies. I learned to connect typed API contracts, authorization, persistence, queues, analyzers, retrieval, model validation, realtime delivery, and interface states through explicit boundaries. I also improved my ability to diagnose failures across containers and asynchronous processes, write behavior-focused tests, and document a reproducible development workflow. Because I completed the final project independently, I had to make and verify the architectural trade-offs, prioritize features, control scope, and maintain consistency between backend, frontend, infrastructure, tests, and documentation [14].</w:t>
       </w:r>
     </w:p>
     <w:p>
@@ -4328,6 +4491,7 @@
           <w:sz w:val="28"/>
           <w:szCs w:val="28"/>
         </w:rPr>
+        <w:lastRenderedPageBreak/>
         <w:t>Add organization and team features with an explicit authorization model, audit log, and repository-sharing rules.</w:t>
       </w:r>
     </w:p>
@@ -4492,7 +4656,6 @@
           <w:sz w:val="28"/>
           <w:szCs w:val="28"/>
         </w:rPr>
-        <w:lastRenderedPageBreak/>
         <w:t>The project also showed that AI-assisted review should not be designed as unrestricted text generation. Deterministic tools, focused retrieval, structured contracts, source-line validation, reproducible scoring, and observable traces are necessary to make model output useful in an engineering workflow. Although further production hardening and evaluation are required, the final product meets the internship objective and provides a strong foundation for future development.</w:t>
       </w:r>
     </w:p>
@@ -4534,6 +4697,8 @@
     </w:p>
     <w:p>
       <w:pPr>
+        <w:spacing w:after="0"/>
+        <w:ind w:firstLine="0"/>
         <w:rPr>
           <w:sz w:val="28"/>
           <w:szCs w:val="28"/>
@@ -4543,6 +4708,8 @@
     </w:p>
     <w:p>
       <w:pPr>
+        <w:spacing w:after="0"/>
+        <w:ind w:firstLine="0"/>
         <w:rPr>
           <w:sz w:val="28"/>
           <w:szCs w:val="28"/>
@@ -4552,169 +4719,8 @@
     </w:p>
     <w:p>
       <w:pPr>
-        <w:rPr>
-          <w:sz w:val="28"/>
-          <w:szCs w:val="28"/>
-          <w:lang w:val="vi-VN"/>
-        </w:rPr>
-      </w:pPr>
-    </w:p>
-    <w:p>
-      <w:pPr>
-        <w:rPr>
-          <w:sz w:val="28"/>
-          <w:szCs w:val="28"/>
-          <w:lang w:val="vi-VN"/>
-        </w:rPr>
-      </w:pPr>
-    </w:p>
-    <w:p>
-      <w:pPr>
-        <w:rPr>
-          <w:sz w:val="28"/>
-          <w:szCs w:val="28"/>
-          <w:lang w:val="vi-VN"/>
-        </w:rPr>
-      </w:pPr>
-    </w:p>
-    <w:p>
-      <w:pPr>
-        <w:rPr>
-          <w:sz w:val="28"/>
-          <w:szCs w:val="28"/>
-          <w:lang w:val="vi-VN"/>
-        </w:rPr>
-      </w:pPr>
-    </w:p>
-    <w:p>
-      <w:pPr>
-        <w:rPr>
-          <w:sz w:val="28"/>
-          <w:szCs w:val="28"/>
-          <w:lang w:val="vi-VN"/>
-        </w:rPr>
-      </w:pPr>
-    </w:p>
-    <w:p>
-      <w:pPr>
-        <w:rPr>
-          <w:sz w:val="28"/>
-          <w:szCs w:val="28"/>
-          <w:lang w:val="vi-VN"/>
-        </w:rPr>
-      </w:pPr>
-    </w:p>
-    <w:p>
-      <w:pPr>
-        <w:rPr>
-          <w:sz w:val="28"/>
-          <w:szCs w:val="28"/>
-          <w:lang w:val="vi-VN"/>
-        </w:rPr>
-      </w:pPr>
-    </w:p>
-    <w:p>
-      <w:pPr>
-        <w:rPr>
-          <w:sz w:val="28"/>
-          <w:szCs w:val="28"/>
-          <w:lang w:val="vi-VN"/>
-        </w:rPr>
-      </w:pPr>
-    </w:p>
-    <w:p>
-      <w:pPr>
-        <w:rPr>
-          <w:sz w:val="28"/>
-          <w:szCs w:val="28"/>
-          <w:lang w:val="vi-VN"/>
-        </w:rPr>
-      </w:pPr>
-    </w:p>
-    <w:p>
-      <w:pPr>
-        <w:rPr>
-          <w:sz w:val="28"/>
-          <w:szCs w:val="28"/>
-          <w:lang w:val="vi-VN"/>
-        </w:rPr>
-      </w:pPr>
-    </w:p>
-    <w:p>
-      <w:pPr>
-        <w:rPr>
-          <w:sz w:val="28"/>
-          <w:szCs w:val="28"/>
-          <w:lang w:val="vi-VN"/>
-        </w:rPr>
-      </w:pPr>
-    </w:p>
-    <w:p>
-      <w:pPr>
-        <w:rPr>
-          <w:sz w:val="28"/>
-          <w:szCs w:val="28"/>
-          <w:lang w:val="vi-VN"/>
-        </w:rPr>
-      </w:pPr>
-    </w:p>
-    <w:p>
-      <w:pPr>
-        <w:rPr>
-          <w:sz w:val="28"/>
-          <w:szCs w:val="28"/>
-          <w:lang w:val="vi-VN"/>
-        </w:rPr>
-      </w:pPr>
-    </w:p>
-    <w:p>
-      <w:pPr>
-        <w:rPr>
-          <w:sz w:val="28"/>
-          <w:szCs w:val="28"/>
-          <w:lang w:val="vi-VN"/>
-        </w:rPr>
-      </w:pPr>
-    </w:p>
-    <w:p>
-      <w:pPr>
-        <w:rPr>
-          <w:sz w:val="28"/>
-          <w:szCs w:val="28"/>
-          <w:lang w:val="vi-VN"/>
-        </w:rPr>
-      </w:pPr>
-    </w:p>
-    <w:p>
-      <w:pPr>
-        <w:rPr>
-          <w:sz w:val="28"/>
-          <w:szCs w:val="28"/>
-          <w:lang w:val="vi-VN"/>
-        </w:rPr>
-      </w:pPr>
-    </w:p>
-    <w:p>
-      <w:pPr>
-        <w:rPr>
-          <w:sz w:val="28"/>
-          <w:szCs w:val="28"/>
-          <w:lang w:val="vi-VN"/>
-        </w:rPr>
-      </w:pPr>
-    </w:p>
-    <w:p>
-      <w:pPr>
-        <w:rPr>
-          <w:sz w:val="28"/>
-          <w:szCs w:val="28"/>
-          <w:lang w:val="vi-VN"/>
-        </w:rPr>
-      </w:pPr>
-    </w:p>
-    <w:p>
-      <w:pPr>
         <w:spacing w:after="0"/>
+        <w:ind w:firstLine="0"/>
         <w:rPr>
           <w:sz w:val="28"/>
           <w:szCs w:val="28"/>
@@ -6062,13 +6068,6 @@
                 <w:lang w:eastAsia="en-US"/>
               </w:rPr>
             </w:pPr>
-            <w:r>
-              <w:pict w14:anchorId="3CE0969D">
-                <v:shape id="_x0000_i1026" type="#_x0000_t75" style="width:192pt;height:150.85pt">
-                  <v:imagedata r:id="rId29" o:title=""/>
-                </v:shape>
-              </w:pict>
-            </w:r>
           </w:p>
         </w:tc>
       </w:tr>
@@ -6361,7 +6360,7 @@
                 <w:rFonts w:eastAsia="Calibri"/>
                 <w:sz w:val="28"/>
                 <w:szCs w:val="28"/>
-                <w:lang w:eastAsia="en-US"/>
+                <w:lang w:val="vi-VN" w:eastAsia="en-US"/>
               </w:rPr>
             </w:pPr>
             <w:r>
@@ -6371,7 +6370,25 @@
                 <w:szCs w:val="28"/>
                 <w:lang w:eastAsia="en-US"/>
               </w:rPr>
-              <w:t>Hanoi, 20 September 20     .</w:t>
+              <w:t xml:space="preserve">Hanoi, </w:t>
+            </w:r>
+            <w:r>
+              <w:rPr>
+                <w:rFonts w:eastAsia="Calibri"/>
+                <w:sz w:val="28"/>
+                <w:szCs w:val="28"/>
+                <w:lang w:val="vi-VN" w:eastAsia="en-US"/>
+              </w:rPr>
+              <w:t xml:space="preserve">   </w:t>
+            </w:r>
+            <w:r>
+              <w:rPr>
+                <w:rFonts w:eastAsia="Calibri"/>
+                <w:sz w:val="28"/>
+                <w:szCs w:val="28"/>
+                <w:lang w:eastAsia="en-US"/>
+              </w:rPr>
+              <w:t xml:space="preserve"> September 20     </w:t>
             </w:r>
           </w:p>
           <w:p>
@@ -6433,46 +6450,16 @@
           <w:lang w:val="vi-VN"/>
         </w:rPr>
       </w:pPr>
-    </w:p>
-    <w:p>
-      <w:pPr>
-        <w:spacing w:after="0"/>
-        <w:rPr>
-          <w:sz w:val="28"/>
-          <w:szCs w:val="28"/>
-          <w:lang w:val="vi-VN"/>
-        </w:rPr>
-      </w:pPr>
-    </w:p>
-    <w:p>
-      <w:pPr>
-        <w:spacing w:after="0"/>
-        <w:rPr>
-          <w:sz w:val="28"/>
-          <w:szCs w:val="28"/>
-          <w:lang w:val="vi-VN"/>
-        </w:rPr>
-      </w:pPr>
-    </w:p>
-    <w:p>
-      <w:pPr>
-        <w:spacing w:after="0"/>
-        <w:rPr>
-          <w:sz w:val="28"/>
-          <w:szCs w:val="28"/>
-          <w:lang w:val="vi-VN"/>
-        </w:rPr>
-      </w:pPr>
-    </w:p>
-    <w:p>
-      <w:pPr>
-        <w:spacing w:after="0"/>
-        <w:rPr>
-          <w:sz w:val="28"/>
-          <w:szCs w:val="28"/>
-          <w:lang w:val="vi-VN"/>
-        </w:rPr>
-      </w:pPr>
+      <w:r>
+        <w:rPr>
+          <w:noProof/>
+        </w:rPr>
+        <w:pict w14:anchorId="688939DF">
+          <v:shape id="_x0000_s1029" type="#_x0000_t75" style="position:absolute;left:0;text-align:left;margin-left:126.15pt;margin-top:-19.5pt;width:192pt;height:151.2pt;z-index:1;mso-position-horizontal-relative:text;mso-position-vertical-relative:text;mso-width-relative:page;mso-height-relative:page">
+            <v:imagedata r:id="rId29" o:title=""/>
+          </v:shape>
+        </w:pict>
+      </w:r>
     </w:p>
     <w:p>
       <w:pPr>
@@ -6628,7 +6615,6 @@
               <w:suppressAutoHyphens w:val="0"/>
               <w:spacing w:after="0"/>
               <w:ind w:firstLine="0"/>
-              <w:jc w:val="center"/>
               <w:rPr>
                 <w:rFonts w:eastAsia="Calibri"/>
                 <w:sz w:val="28"/>
@@ -6642,7 +6628,6 @@
               <w:suppressAutoHyphens w:val="0"/>
               <w:spacing w:after="0"/>
               <w:ind w:firstLine="0"/>
-              <w:jc w:val="center"/>
               <w:rPr>
                 <w:rFonts w:eastAsia="Calibri"/>
                 <w:sz w:val="28"/>
@@ -6656,63 +6641,6 @@
               <w:suppressAutoHyphens w:val="0"/>
               <w:spacing w:after="0"/>
               <w:ind w:firstLine="0"/>
-              <w:jc w:val="center"/>
-              <w:rPr>
-                <w:rFonts w:eastAsia="Calibri"/>
-                <w:sz w:val="28"/>
-                <w:szCs w:val="28"/>
-                <w:lang w:val="vi-VN" w:eastAsia="en-US"/>
-              </w:rPr>
-            </w:pPr>
-          </w:p>
-          <w:p>
-            <w:pPr>
-              <w:suppressAutoHyphens w:val="0"/>
-              <w:spacing w:after="0"/>
-              <w:ind w:firstLine="0"/>
-              <w:jc w:val="center"/>
-              <w:rPr>
-                <w:rFonts w:eastAsia="Calibri"/>
-                <w:sz w:val="28"/>
-                <w:szCs w:val="28"/>
-                <w:lang w:val="vi-VN" w:eastAsia="en-US"/>
-              </w:rPr>
-            </w:pPr>
-          </w:p>
-          <w:p>
-            <w:pPr>
-              <w:suppressAutoHyphens w:val="0"/>
-              <w:spacing w:after="0"/>
-              <w:ind w:firstLine="0"/>
-              <w:jc w:val="center"/>
-              <w:rPr>
-                <w:rFonts w:eastAsia="Calibri"/>
-                <w:sz w:val="28"/>
-                <w:szCs w:val="28"/>
-                <w:lang w:val="vi-VN" w:eastAsia="en-US"/>
-              </w:rPr>
-            </w:pPr>
-          </w:p>
-          <w:p>
-            <w:pPr>
-              <w:suppressAutoHyphens w:val="0"/>
-              <w:spacing w:after="0"/>
-              <w:ind w:firstLine="0"/>
-              <w:jc w:val="center"/>
-              <w:rPr>
-                <w:rFonts w:eastAsia="Calibri"/>
-                <w:sz w:val="28"/>
-                <w:szCs w:val="28"/>
-                <w:lang w:val="vi-VN" w:eastAsia="en-US"/>
-              </w:rPr>
-            </w:pPr>
-          </w:p>
-          <w:p>
-            <w:pPr>
-              <w:suppressAutoHyphens w:val="0"/>
-              <w:spacing w:after="0"/>
-              <w:ind w:firstLine="0"/>
-              <w:jc w:val="center"/>
               <w:rPr>
                 <w:rFonts w:eastAsia="Calibri"/>
                 <w:sz w:val="28"/>
@@ -6740,7 +6668,6 @@
               <w:suppressAutoHyphens w:val="0"/>
               <w:spacing w:after="0"/>
               <w:ind w:firstLine="0"/>
-              <w:jc w:val="center"/>
               <w:rPr>
                 <w:rFonts w:eastAsia="Calibri"/>
                 <w:sz w:val="28"/>
@@ -6776,20 +6703,6 @@
                 <w:lang w:val="vi-VN" w:eastAsia="en-US"/>
               </w:rPr>
             </w:pPr>
-          </w:p>
-          <w:p>
-            <w:pPr>
-              <w:suppressAutoHyphens w:val="0"/>
-              <w:spacing w:after="0"/>
-              <w:ind w:firstLine="0"/>
-              <w:jc w:val="center"/>
-              <w:rPr>
-                <w:rFonts w:eastAsia="Calibri"/>
-                <w:sz w:val="28"/>
-                <w:szCs w:val="28"/>
-                <w:lang w:val="vi-VN" w:eastAsia="en-US"/>
-              </w:rPr>
-            </w:pPr>
             <w:r>
               <w:rPr>
                 <w:rFonts w:eastAsia="Calibri"/>
@@ -6799,7 +6712,7 @@
                 <w:lang w:eastAsia="en-US"/>
               </w:rPr>
               <w:pict w14:anchorId="6D4D548E">
-                <v:shape id="Picture 4" o:spid="_x0000_i1030" type="#_x0000_t75" style="width:109.7pt;height:108pt;visibility:visible">
+                <v:shape id="Picture 4" o:spid="_x0000_i1026" type="#_x0000_t75" style="width:109.8pt;height:108pt;visibility:visible">
                   <v:imagedata r:id="rId8" o:title=""/>
                 </v:shape>
               </w:pict>
@@ -6946,6 +6859,7 @@
                 <w:szCs w:val="36"/>
                 <w:lang w:eastAsia="en-US"/>
               </w:rPr>
+              <w:lastRenderedPageBreak/>
               <w:t>……………………………………….…………………………</w:t>
             </w:r>
           </w:p>
@@ -7212,14 +7126,40 @@
               <w:suppressAutoHyphens w:val="0"/>
               <w:spacing w:after="0"/>
               <w:ind w:firstLine="0"/>
-              <w:jc w:val="center"/>
+              <w:rPr>
+                <w:rFonts w:eastAsia="Calibri"/>
+                <w:sz w:val="28"/>
+                <w:szCs w:val="28"/>
+                <w:lang w:val="vi-VN" w:eastAsia="en-US"/>
+              </w:rPr>
+            </w:pPr>
+            <w:r>
+              <w:rPr>
+                <w:rFonts w:eastAsia="Calibri"/>
+                <w:sz w:val="28"/>
+                <w:szCs w:val="28"/>
+                <w:lang w:val="vi-VN" w:eastAsia="en-US"/>
+              </w:rPr>
+              <w:t xml:space="preserve">                 </w:t>
+            </w:r>
+            <w:r>
               <w:rPr>
                 <w:rFonts w:eastAsia="Calibri"/>
                 <w:sz w:val="28"/>
                 <w:szCs w:val="28"/>
                 <w:lang w:eastAsia="en-US"/>
               </w:rPr>
-            </w:pPr>
+              <w:t xml:space="preserve">Hanoi, </w:t>
+            </w:r>
+            <w:r>
+              <w:rPr>
+                <w:rFonts w:eastAsia="Calibri"/>
+                <w:sz w:val="28"/>
+                <w:szCs w:val="28"/>
+                <w:lang w:val="vi-VN" w:eastAsia="en-US"/>
+              </w:rPr>
+              <w:t xml:space="preserve">  </w:t>
+            </w:r>
             <w:r>
               <w:rPr>
                 <w:rFonts w:eastAsia="Calibri"/>
@@ -7227,7 +7167,25 @@
                 <w:szCs w:val="28"/>
                 <w:lang w:eastAsia="en-US"/>
               </w:rPr>
-              <w:t>Hanoi, 12 September 20     .</w:t>
+              <w:t xml:space="preserve"> </w:t>
+            </w:r>
+            <w:r>
+              <w:rPr>
+                <w:rFonts w:eastAsia="Calibri"/>
+                <w:sz w:val="28"/>
+                <w:szCs w:val="28"/>
+                <w:lang w:val="vi-VN" w:eastAsia="en-US"/>
+              </w:rPr>
+              <w:t xml:space="preserve"> </w:t>
+            </w:r>
+            <w:r>
+              <w:rPr>
+                <w:rFonts w:eastAsia="Calibri"/>
+                <w:sz w:val="28"/>
+                <w:szCs w:val="28"/>
+                <w:lang w:eastAsia="en-US"/>
+              </w:rPr>
+              <w:t xml:space="preserve">September 20     </w:t>
             </w:r>
           </w:p>
           <w:p>
@@ -7276,6 +7234,52 @@
               <w:t>(Signature &amp; Full name)</w:t>
             </w:r>
           </w:p>
+          <w:p>
+            <w:pPr>
+              <w:suppressAutoHyphens w:val="0"/>
+              <w:spacing w:after="0"/>
+              <w:ind w:firstLine="0"/>
+              <w:jc w:val="center"/>
+              <w:rPr>
+                <w:rFonts w:eastAsia="Calibri"/>
+                <w:sz w:val="28"/>
+                <w:szCs w:val="28"/>
+                <w:lang w:eastAsia="en-US"/>
+              </w:rPr>
+            </w:pPr>
+          </w:p>
+        </w:tc>
+      </w:tr>
+      <w:tr>
+        <w:tc>
+          <w:tcPr>
+            <w:tcW w:w="4558" w:type="dxa"/>
+            <w:tcMar>
+              <w:top w:w="144" w:type="dxa"/>
+              <w:left w:w="288" w:type="dxa"/>
+              <w:bottom w:w="144" w:type="dxa"/>
+              <w:right w:w="288" w:type="dxa"/>
+            </w:tcMar>
+          </w:tcPr>
+          <w:p>
+            <w:pPr>
+              <w:suppressAutoHyphens w:val="0"/>
+              <w:spacing w:after="0"/>
+              <w:ind w:firstLine="0"/>
+              <w:jc w:val="center"/>
+              <w:rPr>
+                <w:rFonts w:eastAsia="Calibri"/>
+                <w:sz w:val="28"/>
+                <w:szCs w:val="28"/>
+                <w:lang w:eastAsia="en-US"/>
+              </w:rPr>
+            </w:pPr>
+          </w:p>
+        </w:tc>
+        <w:tc>
+          <w:tcPr>
+            <w:tcW w:w="5267" w:type="dxa"/>
+          </w:tcPr>
           <w:p>
             <w:pPr>
               <w:suppressAutoHyphens w:val="0"/>
@@ -8787,7 +8791,6 @@
   <w:style w:type="character" w:default="1" w:styleId="DefaultParagraphFont">
     <w:name w:val="Default Paragraph Font"/>
     <w:uiPriority w:val="1"/>
-    <w:semiHidden/>
     <w:unhideWhenUsed/>
   </w:style>
   <w:style w:type="table" w:default="1" w:styleId="TableNormal">

</xml_diff>